<commit_message>
docs: apply review edits to bilingual stakeholder-feedback reply memos
</commit_message>
<xml_diff>
--- a/docs/TIRDO-Majibu-Mfumo-wa-Maoni-ya-Wadau.docx
+++ b/docs/TIRDO-Majibu-Mfumo-wa-Maoni-ya-Wadau.docx
@@ -38,7 +38,7 @@
         <w:pBdr>
           <w:bottom w:val="single" w:color="F2C500" w:sz="18" w:space="8"/>
         </w:pBdr>
-        <w:spacing w:after="220"/>
+        <w:spacing w:after="150"/>
         <w:jc w:val="center"/>
       </w:pPr>
       <w:r>
@@ -256,7 +256,7 @@
     </w:tbl>
     <w:p>
       <w:pPr>
-        <w:spacing w:after="180" w:before="160"/>
+        <w:spacing w:after="120" w:before="110"/>
       </w:pPr>
       <w:r>
         <w:rPr>
@@ -281,7 +281,7 @@
     </w:p>
     <w:p>
       <w:pPr>
-        <w:spacing w:after="150"/>
+        <w:spacing w:after="90"/>
       </w:pPr>
       <w:r>
         <w:rPr>
@@ -294,7 +294,7 @@
     </w:p>
     <w:p>
       <w:pPr>
-        <w:spacing w:after="150"/>
+        <w:spacing w:after="90"/>
       </w:pPr>
       <w:r>
         <w:rPr>
@@ -312,7 +312,7 @@
           <w:ilvl w:val="0"/>
           <w:numId w:val="2"/>
         </w:numPr>
-        <w:spacing w:after="80"/>
+        <w:spacing w:after="54"/>
       </w:pPr>
       <w:r>
         <w:rPr>
@@ -330,7 +330,7 @@
           <w:sz w:val="22"/>
           <w:szCs w:val="22"/>
         </w:rPr>
-        <w:t xml:space="preserve">ukurasa wa maoni unawawezesha wadau wa sekta ya viwanda kutoa alama kwa huduma za TIRDO (1–5) na kuwasilisha pongezi, lalamiko, pendekezo au swali kuhusu eneo husika la huduma; kila wasilisho huhifadhiwa na timu husika hupokea taarifa kwa barua pepe.</w:t>
+        <w:t xml:space="preserve">ukurasa wa maoni umewekwa na unawawezesha wadau wa sekta ya viwanda kutoa alama kwa huduma za TIRDO (1–5) na kuwasilisha pongezi, lalamiko, pendekezo au swali kuhusu eneo husika la huduma; kila wasilisho huhifadhiwa na timu husika hupokea taarifa kwa barua pepe.</w:t>
       </w:r>
     </w:p>
     <w:p>
@@ -340,7 +340,7 @@
           <w:ilvl w:val="0"/>
           <w:numId w:val="2"/>
         </w:numPr>
-        <w:spacing w:after="80"/>
+        <w:spacing w:after="54"/>
       </w:pPr>
       <w:r>
         <w:rPr>
@@ -368,7 +368,7 @@
           <w:ilvl w:val="0"/>
           <w:numId w:val="2"/>
         </w:numPr>
-        <w:spacing w:after="80"/>
+        <w:spacing w:after="54"/>
       </w:pPr>
       <w:r>
         <w:rPr>
@@ -386,7 +386,7 @@
           <w:sz w:val="22"/>
           <w:szCs w:val="22"/>
         </w:rPr>
-        <w:t xml:space="preserve">umechapishwa ukiainisha viwango vya huduma, muda wa utoaji, na haki na wajibu wa wateja. Upo kwa Kiingereza na Kiswahili, na menejimenti inaweza kuuhariri moja kwa moja ndani ya mfumo bila kuhitaji mabadiliko ya kiufundi.</w:t>
+        <w:t xml:space="preserve">sasa umechapishwa ukiainisha viwango vya huduma, muda wa utoaji, na haki na wajibu wa wateja. Upo kwa Kiingereza na Kiswahili, na menejimenti inaweza kuuhariri moja kwa moja ndani ya mfumo bila kuhitaji mabadiliko ya kiufundi.</w:t>
       </w:r>
     </w:p>
     <w:p>
@@ -396,7 +396,7 @@
           <w:ilvl w:val="0"/>
           <w:numId w:val="2"/>
         </w:numPr>
-        <w:spacing w:after="80"/>
+        <w:spacing w:after="54"/>
       </w:pPr>
       <w:r>
         <w:rPr>
@@ -414,7 +414,7 @@
           <w:sz w:val="22"/>
           <w:szCs w:val="22"/>
         </w:rPr>
-        <w:t xml:space="preserve">wafanyakazi hushughulikia kila wasilisho, huandika majibu na kuliweka kuwa limekamilika; kila hatua hunakiliwa katika kumbukumbu ya ukaguzi isiyoweza kubadilishwa.</w:t>
+        <w:t xml:space="preserve">mfumo unawawezesha wafanyakazi kushughulikia kila wasilisho, kuandika majibu na kuliweka kuwa limekamilika; kila hatua hunakiliwa katika kumbukumbu ya ukaguzi isiyoweza kubadilishwa.</w:t>
       </w:r>
     </w:p>
     <w:p>
@@ -424,7 +424,7 @@
           <w:ilvl w:val="0"/>
           <w:numId w:val="2"/>
         </w:numPr>
-        <w:spacing w:after="80"/>
+        <w:spacing w:after="54"/>
       </w:pPr>
       <w:r>
         <w:rPr>
@@ -447,7 +447,7 @@
     </w:p>
     <w:p>
       <w:pPr>
-        <w:spacing w:after="150"/>
+        <w:spacing w:after="90"/>
       </w:pPr>
       <w:r>
         <w:rPr>
@@ -470,7 +470,7 @@
     </w:p>
     <w:p>
       <w:pPr>
-        <w:spacing w:after="150"/>
+        <w:spacing w:after="90"/>
       </w:pPr>
       <w:r>
         <w:rPr>
@@ -493,7 +493,7 @@
     </w:p>
     <w:p>
       <w:pPr>
-        <w:spacing w:after="150"/>
+        <w:spacing w:after="90"/>
       </w:pPr>
       <w:r>
         <w:rPr>
@@ -511,7 +511,7 @@
           <w:ilvl w:val="0"/>
           <w:numId w:val="3"/>
         </w:numPr>
-        <w:spacing w:after="80"/>
+        <w:spacing w:after="54"/>
       </w:pPr>
       <w:r>
         <w:rPr>
@@ -529,7 +529,7 @@
           <w:ilvl w:val="0"/>
           <w:numId w:val="3"/>
         </w:numPr>
-        <w:spacing w:after="80"/>
+        <w:spacing w:after="54"/>
       </w:pPr>
       <w:r>
         <w:rPr>
@@ -547,7 +547,7 @@
           <w:ilvl w:val="0"/>
           <w:numId w:val="3"/>
         </w:numPr>
-        <w:spacing w:after="80"/>
+        <w:spacing w:after="54"/>
       </w:pPr>
       <w:r>
         <w:rPr>
@@ -565,7 +565,7 @@
           <w:ilvl w:val="0"/>
           <w:numId w:val="3"/>
         </w:numPr>
-        <w:spacing w:after="80"/>
+        <w:spacing w:after="54"/>
       </w:pPr>
       <w:r>
         <w:rPr>
@@ -578,7 +578,7 @@
     </w:p>
     <w:p>
       <w:pPr>
-        <w:spacing w:after="150"/>
+        <w:spacing w:after="90"/>
       </w:pPr>
       <w:r>
         <w:rPr>
@@ -591,7 +591,7 @@
     </w:p>
     <w:p>
       <w:pPr>
-        <w:spacing w:before="360"/>
+        <w:spacing w:before="90"/>
       </w:pPr>
       <w:r>
         <w:rPr>
@@ -624,7 +624,7 @@
     </w:p>
     <w:p>
       <w:pPr>
-        <w:spacing w:before="260"/>
+        <w:spacing w:before="40"/>
       </w:pPr>
       <w:r>
         <w:rPr>
@@ -639,7 +639,7 @@
     </w:p>
     <w:sectPr>
       <w:pgSz w:w="12240" w:h="15840" w:orient="portrait"/>
-      <w:pgMar w:top="1200" w:right="1440" w:bottom="1100" w:left="1440" w:header="708" w:footer="708" w:gutter="0"/>
+      <w:pgMar w:top="1000" w:right="1440" w:bottom="560" w:left="1440" w:header="708" w:footer="708" w:gutter="0"/>
       <w:pgNumType/>
       <w:docGrid w:linePitch="360"/>
     </w:sectPr>

</xml_diff>